<commit_message>
En el scriptevaluc2 esta el que presentaremos, ocupalo de ejemplo
</commit_message>
<xml_diff>
--- a/00_Documentacion/01_DocumentacionProyecto/Informe/DP_Informe_Requerimiento.docx
+++ b/00_Documentacion/01_DocumentacionProyecto/Informe/DP_Informe_Requerimiento.docx
@@ -1416,7 +1416,11 @@
         </w:rPr>
       </w:pPr>
       <w:r>
-        <w:rPr/>
+        <w:rPr>
+          <w:rFonts w:eastAsia="Arial" w:cs="Arial" w:ascii="Arial" w:hAnsi="Arial"/>
+          <w:sz w:val="28"/>
+          <w:szCs w:val="28"/>
+        </w:rPr>
       </w:r>
     </w:p>
     <w:p>
@@ -1527,7 +1531,11 @@
         </w:rPr>
       </w:pPr>
       <w:r>
-        <w:rPr/>
+        <w:rPr>
+          <w:rFonts w:eastAsia="Arial" w:cs="Arial" w:ascii="Arial" w:hAnsi="Arial"/>
+          <w:sz w:val="28"/>
+          <w:szCs w:val="28"/>
+        </w:rPr>
       </w:r>
     </w:p>
     <w:p>
@@ -2068,83 +2076,29 @@
           <w:sz w:val="22"/>
           <w:szCs w:val="24"/>
         </w:rPr>
-        <w:t xml:space="preserve">El proceso de venta (RF-01) </w:t>
-      </w:r>
-      <w:r>
-        <w:rPr>
-          <w:rFonts w:eastAsia="Arial" w:cs="Arial" w:ascii="Arial" w:hAnsi="Arial"/>
-          <w:b w:val="false"/>
-          <w:sz w:val="22"/>
-          <w:szCs w:val="24"/>
-        </w:rPr>
-        <w:t>se define un</w:t>
-      </w:r>
-      <w:r>
-        <w:rPr>
-          <w:rFonts w:eastAsia="Arial" w:cs="Arial" w:ascii="Arial" w:hAnsi="Arial"/>
-          <w:b w:val="false"/>
-          <w:sz w:val="22"/>
-          <w:szCs w:val="24"/>
-        </w:rPr>
-        <w:t xml:space="preserve"> RECORD que  agrupa y  transporta </w:t>
-      </w:r>
-      <w:r>
-        <w:rPr>
-          <w:rFonts w:eastAsia="Arial" w:cs="Arial" w:ascii="Arial" w:hAnsi="Arial"/>
-          <w:b w:val="false"/>
-          <w:sz w:val="22"/>
-          <w:szCs w:val="24"/>
-        </w:rPr>
-        <w:t xml:space="preserve">los datos de  cada pasaje a partir de atributos que pertenecen a la misma entidad </w:t>
-      </w:r>
-      <w:r>
-        <w:rPr>
-          <w:rFonts w:eastAsia="Arial" w:cs="Arial" w:ascii="Arial" w:hAnsi="Arial"/>
-          <w:b w:val="false"/>
-          <w:sz w:val="22"/>
-          <w:szCs w:val="24"/>
-        </w:rPr>
-        <w:t>como una unidad a lo largo del procedimiento, desde que se validan hasta que se persisten.</w:t>
-      </w:r>
-    </w:p>
-    <w:p>
-      <w:pPr>
-        <w:pStyle w:val="normal1"/>
-        <w:spacing w:lineRule="auto" w:line="324" w:before="0" w:afterAutospacing="0" w:after="160"/>
-        <w:ind w:hanging="0" w:left="0"/>
-        <w:jc w:val="both"/>
-        <w:rPr>
-          <w:rFonts w:ascii="Arial" w:hAnsi="Arial" w:eastAsia="Arial" w:cs="Arial"/>
-          <w:sz w:val="24"/>
-          <w:szCs w:val="24"/>
-        </w:rPr>
-      </w:pPr>
-      <w:r>
-        <w:rPr>
-          <w:rFonts w:eastAsia="Arial" w:cs="Arial" w:ascii="Arial" w:hAnsi="Arial"/>
-          <w:b w:val="false"/>
-          <w:sz w:val="22"/>
-          <w:szCs w:val="24"/>
-        </w:rPr>
-        <w:t xml:space="preserve">La alternativa </w:t>
-      </w:r>
-      <w:r>
-        <w:rPr>
-          <w:rFonts w:eastAsia="Arial" w:cs="Arial" w:ascii="Arial" w:hAnsi="Arial"/>
-          <w:b w:val="false"/>
-          <w:sz w:val="22"/>
-          <w:szCs w:val="24"/>
-        </w:rPr>
-        <w:t xml:space="preserve">de </w:t>
-      </w:r>
-      <w:r>
-        <w:rPr>
-          <w:rFonts w:eastAsia="Arial" w:cs="Arial" w:ascii="Arial" w:hAnsi="Arial"/>
-          <w:b w:val="false"/>
-          <w:sz w:val="22"/>
-          <w:szCs w:val="24"/>
-        </w:rPr>
-        <w:t>declarar siete u ocho variables independientes obliga a pasarlas una por una a cada validación y a cada inserción. Cuando la estructura debe reflejar exactamente una tabla se declara anclada con %ROWTYPE, de modo que un cambio en la tabla se propague sin corregir el bloque.</w:t>
+        <w:t>El proceso de venta (RF-01) se define un RECORD que  agrupa y  transporta los datos de  cada pasaje a partir de atributos que pertenecen a la misma entidad como una unidad a lo largo del procedimiento, desde que se validan hasta que se persisten.</w:t>
+      </w:r>
+    </w:p>
+    <w:p>
+      <w:pPr>
+        <w:pStyle w:val="normal1"/>
+        <w:spacing w:lineRule="auto" w:line="324" w:before="0" w:afterAutospacing="0" w:after="160"/>
+        <w:ind w:hanging="0" w:left="0"/>
+        <w:jc w:val="both"/>
+        <w:rPr>
+          <w:rFonts w:ascii="Arial" w:hAnsi="Arial" w:eastAsia="Arial" w:cs="Arial"/>
+          <w:sz w:val="24"/>
+          <w:szCs w:val="24"/>
+        </w:rPr>
+      </w:pPr>
+      <w:r>
+        <w:rPr>
+          <w:rFonts w:eastAsia="Arial" w:cs="Arial" w:ascii="Arial" w:hAnsi="Arial"/>
+          <w:b w:val="false"/>
+          <w:sz w:val="22"/>
+          <w:szCs w:val="24"/>
+        </w:rPr>
+        <w:t>La alternativa de declarar siete u ocho variables independientes obliga a pasarlas una por una a cada validación y a cada inserción. Cuando la estructura debe reflejar exactamente una tabla se declara anclada con %ROWTYPE, de modo que un cambio en la tabla se propague sin corregir el bloque.</w:t>
       </w:r>
     </w:p>
     <w:p>
@@ -2189,56 +2143,87 @@
         </w:rPr>
       </w:pPr>
       <w:r>
-        <w:rPr/>
-      </w:r>
-    </w:p>
-    <w:p>
-      <w:pPr>
-        <w:pStyle w:val="normal1"/>
-        <w:spacing w:lineRule="auto" w:line="324" w:before="0" w:afterAutospacing="0" w:after="160"/>
-        <w:ind w:hanging="0" w:left="0"/>
-        <w:jc w:val="both"/>
-        <w:rPr>
-          <w:rFonts w:ascii="Arial" w:hAnsi="Arial" w:eastAsia="Arial" w:cs="Arial"/>
-          <w:sz w:val="24"/>
-          <w:szCs w:val="24"/>
-        </w:rPr>
-      </w:pPr>
-      <w:r>
-        <w:rPr>
-          <w:rFonts w:eastAsia="Arial" w:cs="Arial" w:ascii="Arial" w:hAnsi="Arial"/>
-          <w:b w:val="false"/>
-          <w:sz w:val="22"/>
-          <w:szCs w:val="24"/>
-        </w:rPr>
-        <w:t xml:space="preserve">En el proceso de </w:t>
-      </w:r>
-      <w:r>
-        <w:rPr>
-          <w:rFonts w:eastAsia="Arial" w:cs="Arial" w:ascii="Arial" w:hAnsi="Arial"/>
-          <w:b w:val="false"/>
-          <w:sz w:val="22"/>
-          <w:szCs w:val="24"/>
-        </w:rPr>
-        <w:t xml:space="preserve">venta </w:t>
-      </w:r>
-      <w:r>
-        <w:rPr>
-          <w:rFonts w:eastAsia="Arial" w:cs="Arial" w:ascii="Arial" w:hAnsi="Arial"/>
-          <w:b w:val="false"/>
-          <w:sz w:val="22"/>
-          <w:szCs w:val="24"/>
-        </w:rPr>
-        <w:t xml:space="preserve">la cantidad de asientos disponibles esta condicionada por la capacidad del bus que realizara la operación. Por lo tanto, se debe fijar una cota a la venta de asiento de acuerdo a la capacidad. Esta operación se realiza con un VARRAY, dado que la cantidad de elementos a iterar tiene un límite conocido y razonable. </w:t>
-      </w:r>
-      <w:r>
-        <w:rPr>
-          <w:rFonts w:eastAsia="Arial" w:cs="Arial" w:ascii="Arial" w:hAnsi="Arial"/>
-          <w:b w:val="false"/>
-          <w:sz w:val="22"/>
-          <w:szCs w:val="24"/>
-        </w:rPr>
-        <w:t>Una venta de mostrador no supera unos pocos asientos y nunca puede exceder la capacidad del bus.</w:t>
+        <w:rPr>
+          <w:rFonts w:eastAsia="Arial" w:cs="Arial" w:ascii="Arial" w:hAnsi="Arial"/>
+          <w:sz w:val="28"/>
+          <w:szCs w:val="28"/>
+        </w:rPr>
+      </w:r>
+    </w:p>
+    <w:p>
+      <w:pPr>
+        <w:pStyle w:val="normal1"/>
+        <w:spacing w:lineRule="auto" w:line="324" w:before="0" w:afterAutospacing="0" w:after="160"/>
+        <w:ind w:hanging="0" w:left="0"/>
+        <w:jc w:val="both"/>
+        <w:rPr>
+          <w:rFonts w:ascii="Arial" w:hAnsi="Arial" w:eastAsia="Arial" w:cs="Arial"/>
+          <w:sz w:val="24"/>
+          <w:szCs w:val="24"/>
+        </w:rPr>
+      </w:pPr>
+      <w:r>
+        <w:rPr>
+          <w:rFonts w:eastAsia="Arial" w:cs="Arial" w:ascii="Arial" w:hAnsi="Arial"/>
+          <w:b w:val="false"/>
+          <w:sz w:val="22"/>
+          <w:szCs w:val="24"/>
+        </w:rPr>
+        <w:t xml:space="preserve">En el proceso de venta la cantidad de asientos </w:t>
+      </w:r>
+      <w:r>
+        <w:rPr>
+          <w:rFonts w:eastAsia="Arial" w:cs="Arial" w:ascii="Arial" w:hAnsi="Arial"/>
+          <w:b w:val="false"/>
+          <w:sz w:val="22"/>
+          <w:szCs w:val="24"/>
+        </w:rPr>
+        <w:t>del que puede adquerir un cliente esta limitada por programación. Un mismo cliente no puede comprar más de 6 pasajes en una instancia</w:t>
+      </w:r>
+      <w:r>
+        <w:rPr>
+          <w:rFonts w:eastAsia="Arial" w:cs="Arial" w:ascii="Arial" w:hAnsi="Arial"/>
+          <w:b w:val="false"/>
+          <w:sz w:val="22"/>
+          <w:szCs w:val="24"/>
+        </w:rPr>
+        <w:t>. Por lo tanto, se debe fijar una cota a la venta de asiento</w:t>
+      </w:r>
+      <w:r>
+        <w:rPr>
+          <w:rFonts w:eastAsia="Arial" w:cs="Arial" w:ascii="Arial" w:hAnsi="Arial"/>
+          <w:b w:val="false"/>
+          <w:sz w:val="22"/>
+          <w:szCs w:val="24"/>
+        </w:rPr>
+        <w:t>s</w:t>
+      </w:r>
+      <w:r>
+        <w:rPr>
+          <w:rFonts w:eastAsia="Arial" w:cs="Arial" w:ascii="Arial" w:hAnsi="Arial"/>
+          <w:b w:val="false"/>
+          <w:sz w:val="22"/>
+          <w:szCs w:val="24"/>
+        </w:rPr>
+        <w:t xml:space="preserve"> </w:t>
+      </w:r>
+      <w:r>
+        <w:rPr>
+          <w:rFonts w:eastAsia="Arial" w:cs="Arial" w:ascii="Arial" w:hAnsi="Arial"/>
+          <w:b w:val="false"/>
+          <w:sz w:val="22"/>
+          <w:szCs w:val="24"/>
+        </w:rPr>
+        <w:t>por venta.</w:t>
+      </w:r>
+      <w:r>
+        <w:rPr>
+          <w:rFonts w:eastAsia="Arial" w:cs="Arial" w:ascii="Arial" w:hAnsi="Arial"/>
+          <w:b w:val="false"/>
+          <w:sz w:val="22"/>
+          <w:szCs w:val="24"/>
+        </w:rPr>
+        <w:t xml:space="preserve"> Esta operación se realiza con un VARRAY, dado que la cantidad de elementos a iterar tiene un límite conocido y razonable. Una venta de mostrador no supera unos pocos asientos y nunca puede exceder la capacidad del bus.</w:t>
       </w:r>
     </w:p>
     <w:p>
@@ -2311,43 +2296,7 @@
           <w:sz w:val="22"/>
           <w:szCs w:val="24"/>
         </w:rPr>
-        <w:t xml:space="preserve">Ambas resuelven problemas distintos y por eso conviven: el RECORD agrupa atributos heterogéneos de una misma entidad </w:t>
-      </w:r>
-      <w:r>
-        <w:rPr>
-          <w:rFonts w:eastAsia="Arial" w:cs="Arial" w:ascii="Arial" w:hAnsi="Arial"/>
-          <w:b w:val="false"/>
-          <w:sz w:val="22"/>
-          <w:szCs w:val="24"/>
-        </w:rPr>
-        <w:t>(</w:t>
-      </w:r>
-      <w:r>
-        <w:rPr>
-          <w:rFonts w:eastAsia="Arial" w:cs="Arial" w:ascii="Arial" w:hAnsi="Arial"/>
-          <w:b w:val="false"/>
-          <w:sz w:val="22"/>
-          <w:szCs w:val="24"/>
-        </w:rPr>
-        <w:t>viaje, asiento y precio</w:t>
-      </w:r>
-      <w:r>
-        <w:rPr>
-          <w:rFonts w:eastAsia="Arial" w:cs="Arial" w:ascii="Arial" w:hAnsi="Arial"/>
-          <w:b w:val="false"/>
-          <w:sz w:val="22"/>
-          <w:szCs w:val="24"/>
-        </w:rPr>
-        <w:t>)</w:t>
-      </w:r>
-      <w:r>
-        <w:rPr>
-          <w:rFonts w:eastAsia="Arial" w:cs="Arial" w:ascii="Arial" w:hAnsi="Arial"/>
-          <w:b w:val="false"/>
-          <w:sz w:val="22"/>
-          <w:szCs w:val="24"/>
-        </w:rPr>
-        <w:t>, mientras el VARRAY agrupa elementos homogéneos sobre los que se itera. Se descartó una tabla anidada para la lista de asientos porque no impone cota al número de elementos; si el conjunto pudiera crecer de forma indeterminada esa sería la elección correcta, pero no es el caso de una venta. Del mismo modo, un proceso que necesite un único valor no justifica un RECORD, basta una variable.</w:t>
+        <w:t>Ambas resuelven problemas distintos y por eso conviven: el RECORD agrupa atributos heterogéneos de una misma entidad (viaje, asiento y precio), mientras el VARRAY agrupa elementos homogéneos sobre los que se itera. Se descartó una tabla anidada para la lista de asientos porque no impone cota al número de elementos; si el conjunto pudiera crecer de forma indeterminada esa sería la elección correcta, pero no es el caso de una venta. Del mismo modo, un proceso que necesite un único valor no justifica un RECORD, basta una variable.</w:t>
       </w:r>
     </w:p>
     <w:p>
@@ -2422,43 +2371,7 @@
           <w:sz w:val="22"/>
           <w:szCs w:val="24"/>
         </w:rPr>
-        <w:t xml:space="preserve">Un cursor explícito es un </w:t>
-      </w:r>
-      <w:r>
-        <w:rPr>
-          <w:rFonts w:eastAsia="Arial" w:cs="Arial" w:ascii="Arial" w:hAnsi="Arial"/>
-          <w:b w:val="false"/>
-          <w:sz w:val="22"/>
-          <w:szCs w:val="24"/>
-        </w:rPr>
-        <w:t xml:space="preserve">bloque de trabajo </w:t>
-      </w:r>
-      <w:r>
-        <w:rPr>
-          <w:rFonts w:eastAsia="Arial" w:cs="Arial" w:ascii="Arial" w:hAnsi="Arial"/>
-          <w:b w:val="false"/>
-          <w:sz w:val="22"/>
-          <w:szCs w:val="24"/>
-        </w:rPr>
-        <w:t>declarad</w:t>
-      </w:r>
-      <w:r>
-        <w:rPr>
-          <w:rFonts w:eastAsia="Arial" w:cs="Arial" w:ascii="Arial" w:hAnsi="Arial"/>
-          <w:b w:val="false"/>
-          <w:sz w:val="22"/>
-          <w:szCs w:val="24"/>
-        </w:rPr>
-        <w:t>o</w:t>
-      </w:r>
-      <w:r>
-        <w:rPr>
-          <w:rFonts w:eastAsia="Arial" w:cs="Arial" w:ascii="Arial" w:hAnsi="Arial"/>
-          <w:b w:val="false"/>
-          <w:sz w:val="22"/>
-          <w:szCs w:val="24"/>
-        </w:rPr>
-        <w:t xml:space="preserve"> por el programador para recorrer fila por fila el resultado de una consulta que devuelve más de un registro. Es apropiado cuando cada fila requiere un tratamiento individual que no puede expresarse en una sola sentencia SQL. Cuando el resultado se obtiene con una consulta de agregación, la sentencia SQL es preferible.</w:t>
+        <w:t>Un cursor explícito es un bloque de trabajo declarado por el programador para recorrer fila por fila el resultado de una consulta que devuelve más de un registro. Es apropiado cuando cada fila requiere un tratamiento individual que no puede expresarse en una sola sentencia SQL. Cuando el resultado se obtiene con una consulta de agregación, la sentencia SQL es preferible.</w:t>
       </w:r>
     </w:p>
     <w:p>
@@ -2509,52 +2422,7 @@
           <w:sz w:val="22"/>
           <w:szCs w:val="24"/>
         </w:rPr>
-        <w:t>Para este trabajo un ejemplo de trabajo con cursor sin parámetros es e</w:t>
-      </w:r>
-      <w:r>
-        <w:rPr>
-          <w:rFonts w:eastAsia="Arial" w:cs="Arial" w:ascii="Arial" w:hAnsi="Arial"/>
-          <w:b w:val="false"/>
-          <w:sz w:val="22"/>
-          <w:szCs w:val="24"/>
-        </w:rPr>
-        <w:t xml:space="preserve">l control de flota. </w:t>
-      </w:r>
-      <w:r>
-        <w:rPr>
-          <w:rFonts w:eastAsia="Arial" w:cs="Arial" w:ascii="Arial" w:hAnsi="Arial"/>
-          <w:b w:val="false"/>
-          <w:sz w:val="22"/>
-          <w:szCs w:val="24"/>
-        </w:rPr>
-        <w:t>Aquí se</w:t>
-      </w:r>
-      <w:r>
-        <w:rPr>
-          <w:rFonts w:eastAsia="Arial" w:cs="Arial" w:ascii="Arial" w:hAnsi="Arial"/>
-          <w:b w:val="false"/>
-          <w:sz w:val="22"/>
-          <w:szCs w:val="24"/>
-        </w:rPr>
-        <w:t xml:space="preserve"> requiere recorrer todos los viajes en estado programado, sin filtrar por ningún </w:t>
-      </w:r>
-      <w:r>
-        <w:rPr>
-          <w:rFonts w:eastAsia="Arial" w:cs="Arial" w:ascii="Arial" w:hAnsi="Arial"/>
-          <w:b w:val="false"/>
-          <w:sz w:val="22"/>
-          <w:szCs w:val="24"/>
-        </w:rPr>
-        <w:t>parámetro</w:t>
-      </w:r>
-      <w:r>
-        <w:rPr>
-          <w:rFonts w:eastAsia="Arial" w:cs="Arial" w:ascii="Arial" w:hAnsi="Arial"/>
-          <w:b w:val="false"/>
-          <w:sz w:val="22"/>
-          <w:szCs w:val="24"/>
-        </w:rPr>
-        <w:t xml:space="preserve">, para verificar que cada uno tenga bus y conductores asignados antes de habilitar su venta. El conjunto está determinado por una condición fija del negocio el estado del viaje. </w:t>
+        <w:t xml:space="preserve">Para este trabajo un ejemplo de trabajo con cursor sin parámetros es el control de flota. Aquí se requiere recorrer todos los viajes en estado programado, sin filtrar por ningún parámetro, para verificar que cada uno tenga bus y conductores asignados antes de habilitar su venta. El conjunto está determinado por una condición fija del negocio el estado del viaje. </w:t>
       </w:r>
     </w:p>
     <w:p>

</xml_diff>